<commit_message>
completed till feign client call to another service.
</commit_message>
<xml_diff>
--- a/docs (springboot)/module11_caching.docx
+++ b/docs (springboot)/module11_caching.docx
@@ -3024,8 +3024,6 @@
         </w:rPr>
         <w:t>F</w:t>
       </w:r>
-      <w:bookmarkStart w:id="0" w:name="_GoBack"/>
-      <w:bookmarkEnd w:id="0"/>
     </w:p>
     <w:p>
       <w:pPr>
@@ -4822,8 +4820,8 @@
         </w:rPr>
         <w:drawing>
           <wp:inline distT="0" distB="0" distL="114300" distR="114300">
-            <wp:extent cx="5273040" cy="605790"/>
-            <wp:effectExtent l="0" t="0" r="10160" b="3810"/>
+            <wp:extent cx="4473575" cy="513715"/>
+            <wp:effectExtent l="0" t="0" r="9525" b="6985"/>
             <wp:docPr id="17" name="Picture 17"/>
             <wp:cNvGraphicFramePr>
               <a:graphicFrameLocks xmlns:a="http://schemas.openxmlformats.org/drawingml/2006/main" noChangeAspect="1"/>
@@ -4846,7 +4844,7 @@
                   <pic:spPr>
                     <a:xfrm>
                       <a:off x="0" y="0"/>
-                      <a:ext cx="5273040" cy="605790"/>
+                      <a:ext cx="4473575" cy="513715"/>
                     </a:xfrm>
                     <a:prstGeom prst="rect">
                       <a:avLst/>
@@ -6530,6 +6528,7 @@
         <w:keepLines w:val="0"/>
         <w:widowControl/>
         <w:numPr>
+          <w:ilvl w:val="0"/>
           <w:numId w:val="0"/>
         </w:numPr>
         <w:suppressLineNumbers w:val="0"/>
@@ -8294,6 +8293,7 @@
         <w:keepLines w:val="0"/>
         <w:widowControl/>
         <w:numPr>
+          <w:ilvl w:val="0"/>
           <w:numId w:val="0"/>
         </w:numPr>
         <w:suppressLineNumbers w:val="0"/>
@@ -10007,6 +10007,7 @@
         <w:keepLines w:val="0"/>
         <w:widowControl/>
         <w:numPr>
+          <w:ilvl w:val="0"/>
           <w:numId w:val="0"/>
         </w:numPr>
         <w:suppressLineNumbers w:val="0"/>
@@ -11477,16 +11478,7 @@
           <w:szCs w:val="22"/>
           <w:lang w:val="en-IN"/>
         </w:rPr>
-        <w:t>Repeatable Read removes the inconsistency you can face in READ COMMITTED, where the same row might return different values if other transactions commit changes in between</w:t>
-      </w:r>
-      <w:r>
-        <w:rPr>
-          <w:rFonts w:hint="default" w:ascii="Bodoni MT" w:hAnsi="Bodoni MT" w:eastAsia="等线" w:cs="Bodoni MT"/>
-          <w:sz w:val="22"/>
-          <w:szCs w:val="22"/>
-          <w:lang w:val="en-IN"/>
-        </w:rPr>
-        <w:t>.</w:t>
+        <w:t>Repeatable Read removes the inconsistency you can face in READ COMMITTED, where the same row might return different values if other transactions commit changes in between.</w:t>
       </w:r>
     </w:p>
     <w:p>
@@ -14769,6 +14761,7 @@
         <w:keepLines w:val="0"/>
         <w:widowControl/>
         <w:numPr>
+          <w:ilvl w:val="0"/>
           <w:numId w:val="0"/>
         </w:numPr>
         <w:suppressLineNumbers w:val="0"/>
@@ -15234,16 +15227,7 @@
           <w:szCs w:val="22"/>
           <w:lang w:val="en-IN"/>
         </w:rPr>
-        <w:t xml:space="preserve">Now, it T2 tries to update the value, it’ll abort because it contains a stall value </w:t>
-      </w:r>
-      <w:r>
-        <w:rPr>
-          <w:rFonts w:hint="default" w:ascii="Bodoni MT" w:hAnsi="Bodoni MT" w:eastAsia="等线" w:cs="Bodoni MT"/>
-          <w:sz w:val="22"/>
-          <w:szCs w:val="22"/>
-          <w:lang w:val="en-IN"/>
-        </w:rPr>
-        <w:t>(in case of COMMITTED READ it allows the update because T1 has already committed)</w:t>
+        <w:t>Now, it T2 tries to update the value, it’ll abort because it contains a stall value (in case of COMMITTED READ it allows the update because T1 has already committed)</w:t>
       </w:r>
       <w:r>
         <w:rPr>
@@ -15619,6 +15603,7 @@
         <w:keepLines w:val="0"/>
         <w:widowControl/>
         <w:numPr>
+          <w:ilvl w:val="0"/>
           <w:numId w:val="0"/>
         </w:numPr>
         <w:suppressLineNumbers w:val="0"/>
@@ -15762,6 +15747,7 @@
         <w:keepLines w:val="0"/>
         <w:widowControl/>
         <w:numPr>
+          <w:ilvl w:val="0"/>
           <w:numId w:val="0"/>
         </w:numPr>
         <w:suppressLineNumbers w:val="0"/>
@@ -16368,6 +16354,7 @@
         <w:keepLines w:val="0"/>
         <w:widowControl/>
         <w:numPr>
+          <w:ilvl w:val="0"/>
           <w:numId w:val="0"/>
         </w:numPr>
         <w:suppressLineNumbers w:val="0"/>
@@ -16408,16 +16395,7 @@
           <w:szCs w:val="22"/>
           <w:lang w:val="en-IN"/>
         </w:rPr>
-        <w:t xml:space="preserve"> in Spring Boot </w:t>
-      </w:r>
-      <w:r>
-        <w:rPr>
-          <w:rFonts w:hint="default" w:ascii="Bodoni MT" w:hAnsi="Bodoni MT" w:eastAsia="等线" w:cs="Bodoni MT"/>
-          <w:sz w:val="22"/>
-          <w:szCs w:val="22"/>
-          <w:lang w:val="en-IN"/>
-        </w:rPr>
-        <w:t>============</w:t>
+        <w:t xml:space="preserve"> in Spring Boot ============</w:t>
       </w:r>
     </w:p>
     <w:p>
@@ -17084,6 +17062,7 @@
         <w:keepLines w:val="0"/>
         <w:widowControl/>
         <w:numPr>
+          <w:ilvl w:val="0"/>
           <w:numId w:val="0"/>
         </w:numPr>
         <w:suppressLineNumbers w:val="0"/>
@@ -17108,18 +17087,7 @@
           <w:szCs w:val="22"/>
           <w:lang w:val="en-IN"/>
         </w:rPr>
-        <w:t xml:space="preserve">============== Transactional Lock in Spring Data JPA </w:t>
-      </w:r>
-      <w:r>
-        <w:rPr>
-          <w:rFonts w:hint="default" w:ascii="Bodoni MT" w:hAnsi="Bodoni MT" w:eastAsia="等线" w:cs="Bodoni MT"/>
-          <w:b/>
-          <w:bCs/>
-          <w:sz w:val="22"/>
-          <w:szCs w:val="22"/>
-          <w:lang w:val="en-IN"/>
-        </w:rPr>
-        <w:t>==============</w:t>
+        <w:t>============== Transactional Lock in Spring Data JPA ==============</w:t>
       </w:r>
     </w:p>
     <w:p>
@@ -17778,8 +17746,10 @@
           <w:szCs w:val="22"/>
           <w:lang w:val="en-IN"/>
         </w:rPr>
-        <w:t>Now if another transaction try to update, it’ll fail because it will make the version 1 (because it was 0 when it read). but to update, version needs to be 2.</w:t>
-      </w:r>
+        <w:t>Now if another transaction try to update, it’ll fail because it will make the version 1 (because it was 0 when it read). but to update,  version needs to be 2.</w:t>
+      </w:r>
+      <w:bookmarkStart w:id="0" w:name="_GoBack"/>
+      <w:bookmarkEnd w:id="0"/>
     </w:p>
     <w:p>
       <w:pPr>
@@ -19735,6 +19705,7 @@
         <w:keepLines w:val="0"/>
         <w:widowControl/>
         <w:numPr>
+          <w:ilvl w:val="0"/>
           <w:numId w:val="0"/>
         </w:numPr>
         <w:suppressLineNumbers w:val="0"/>
@@ -23074,9 +23045,9 @@
     <w:lsdException w:qFormat="1" w:unhideWhenUsed="0" w:uiPriority="0" w:semiHidden="0" w:name="index 3"/>
     <w:lsdException w:qFormat="1" w:unhideWhenUsed="0" w:uiPriority="0" w:semiHidden="0" w:name="index 4"/>
     <w:lsdException w:qFormat="1" w:unhideWhenUsed="0" w:uiPriority="0" w:semiHidden="0" w:name="index 5"/>
-    <w:lsdException w:unhideWhenUsed="0" w:uiPriority="0" w:semiHidden="0" w:name="index 6"/>
+    <w:lsdException w:qFormat="1" w:unhideWhenUsed="0" w:uiPriority="0" w:semiHidden="0" w:name="index 6"/>
     <w:lsdException w:qFormat="1" w:unhideWhenUsed="0" w:uiPriority="0" w:semiHidden="0" w:name="index 7"/>
-    <w:lsdException w:unhideWhenUsed="0" w:uiPriority="0" w:semiHidden="0" w:name="index 8"/>
+    <w:lsdException w:qFormat="1" w:unhideWhenUsed="0" w:uiPriority="0" w:semiHidden="0" w:name="index 8"/>
     <w:lsdException w:unhideWhenUsed="0" w:uiPriority="0" w:semiHidden="0" w:name="index 9"/>
     <w:lsdException w:unhideWhenUsed="0" w:uiPriority="0" w:semiHidden="0" w:name="toc 1"/>
     <w:lsdException w:unhideWhenUsed="0" w:uiPriority="0" w:semiHidden="0" w:name="toc 2"/>
@@ -23094,7 +23065,7 @@
     <w:lsdException w:qFormat="1" w:unhideWhenUsed="0" w:uiPriority="0" w:semiHidden="0" w:name="footer"/>
     <w:lsdException w:unhideWhenUsed="0" w:uiPriority="0" w:semiHidden="0" w:name="index heading"/>
     <w:lsdException w:qFormat="1" w:uiPriority="0" w:name="caption"/>
-    <w:lsdException w:unhideWhenUsed="0" w:uiPriority="0" w:semiHidden="0" w:name="table of figures"/>
+    <w:lsdException w:qFormat="1" w:unhideWhenUsed="0" w:uiPriority="0" w:semiHidden="0" w:name="table of figures"/>
     <w:lsdException w:qFormat="1" w:unhideWhenUsed="0" w:uiPriority="0" w:semiHidden="0" w:name="envelope address"/>
     <w:lsdException w:qFormat="1" w:unhideWhenUsed="0" w:uiPriority="0" w:semiHidden="0" w:name="envelope return"/>
     <w:lsdException w:qFormat="1" w:unhideWhenUsed="0" w:uiPriority="0" w:semiHidden="0" w:name="footnote reference"/>
@@ -23103,35 +23074,35 @@
     <w:lsdException w:unhideWhenUsed="0" w:uiPriority="0" w:semiHidden="0" w:name="page number"/>
     <w:lsdException w:qFormat="1" w:unhideWhenUsed="0" w:uiPriority="0" w:semiHidden="0" w:name="endnote reference"/>
     <w:lsdException w:qFormat="1" w:unhideWhenUsed="0" w:uiPriority="0" w:semiHidden="0" w:name="endnote text"/>
-    <w:lsdException w:unhideWhenUsed="0" w:uiPriority="0" w:semiHidden="0" w:name="table of authorities"/>
+    <w:lsdException w:qFormat="1" w:unhideWhenUsed="0" w:uiPriority="0" w:semiHidden="0" w:name="table of authorities"/>
     <w:lsdException w:qFormat="1" w:unhideWhenUsed="0" w:uiPriority="0" w:semiHidden="0" w:name="macro"/>
     <w:lsdException w:unhideWhenUsed="0" w:uiPriority="0" w:semiHidden="0" w:name="toa heading"/>
     <w:lsdException w:unhideWhenUsed="0" w:uiPriority="0" w:semiHidden="0" w:name="List"/>
-    <w:lsdException w:unhideWhenUsed="0" w:uiPriority="0" w:semiHidden="0" w:name="List Bullet"/>
-    <w:lsdException w:unhideWhenUsed="0" w:uiPriority="0" w:semiHidden="0" w:name="List Number"/>
-    <w:lsdException w:unhideWhenUsed="0" w:uiPriority="0" w:semiHidden="0" w:name="List 2"/>
+    <w:lsdException w:qFormat="1" w:unhideWhenUsed="0" w:uiPriority="0" w:semiHidden="0" w:name="List Bullet"/>
+    <w:lsdException w:qFormat="1" w:unhideWhenUsed="0" w:uiPriority="0" w:semiHidden="0" w:name="List Number"/>
+    <w:lsdException w:qFormat="1" w:unhideWhenUsed="0" w:uiPriority="0" w:semiHidden="0" w:name="List 2"/>
     <w:lsdException w:unhideWhenUsed="0" w:uiPriority="0" w:semiHidden="0" w:name="List 3"/>
-    <w:lsdException w:unhideWhenUsed="0" w:uiPriority="0" w:semiHidden="0" w:name="List 4"/>
+    <w:lsdException w:qFormat="1" w:unhideWhenUsed="0" w:uiPriority="0" w:semiHidden="0" w:name="List 4"/>
     <w:lsdException w:qFormat="1" w:unhideWhenUsed="0" w:uiPriority="0" w:semiHidden="0" w:name="List 5"/>
     <w:lsdException w:unhideWhenUsed="0" w:uiPriority="0" w:semiHidden="0" w:name="List Bullet 2"/>
     <w:lsdException w:qFormat="1" w:unhideWhenUsed="0" w:uiPriority="0" w:semiHidden="0" w:name="List Bullet 3"/>
     <w:lsdException w:qFormat="1" w:unhideWhenUsed="0" w:uiPriority="0" w:semiHidden="0" w:name="List Bullet 4"/>
     <w:lsdException w:qFormat="1" w:unhideWhenUsed="0" w:uiPriority="0" w:semiHidden="0" w:name="List Bullet 5"/>
-    <w:lsdException w:unhideWhenUsed="0" w:uiPriority="0" w:semiHidden="0" w:name="List Number 2"/>
+    <w:lsdException w:qFormat="1" w:unhideWhenUsed="0" w:uiPriority="0" w:semiHidden="0" w:name="List Number 2"/>
     <w:lsdException w:qFormat="1" w:unhideWhenUsed="0" w:uiPriority="0" w:semiHidden="0" w:name="List Number 3"/>
     <w:lsdException w:qFormat="1" w:unhideWhenUsed="0" w:uiPriority="0" w:semiHidden="0" w:name="List Number 4"/>
-    <w:lsdException w:unhideWhenUsed="0" w:uiPriority="0" w:semiHidden="0" w:name="List Number 5"/>
+    <w:lsdException w:qFormat="1" w:unhideWhenUsed="0" w:uiPriority="0" w:semiHidden="0" w:name="List Number 5"/>
     <w:lsdException w:qFormat="1" w:unhideWhenUsed="0" w:uiPriority="0" w:semiHidden="0" w:name="Title"/>
     <w:lsdException w:qFormat="1" w:unhideWhenUsed="0" w:uiPriority="0" w:semiHidden="0" w:name="Closing"/>
-    <w:lsdException w:unhideWhenUsed="0" w:uiPriority="0" w:semiHidden="0" w:name="Signature"/>
+    <w:lsdException w:qFormat="1" w:unhideWhenUsed="0" w:uiPriority="0" w:semiHidden="0" w:name="Signature"/>
     <w:lsdException w:qFormat="1" w:unhideWhenUsed="0" w:uiPriority="0" w:name="Default Paragraph Font"/>
     <w:lsdException w:qFormat="1" w:unhideWhenUsed="0" w:uiPriority="0" w:semiHidden="0" w:name="Body Text"/>
     <w:lsdException w:qFormat="1" w:unhideWhenUsed="0" w:uiPriority="0" w:semiHidden="0" w:name="Body Text Indent"/>
-    <w:lsdException w:unhideWhenUsed="0" w:uiPriority="0" w:semiHidden="0" w:name="List Continue"/>
+    <w:lsdException w:qFormat="1" w:unhideWhenUsed="0" w:uiPriority="0" w:semiHidden="0" w:name="List Continue"/>
     <w:lsdException w:qFormat="1" w:unhideWhenUsed="0" w:uiPriority="0" w:semiHidden="0" w:name="List Continue 2"/>
-    <w:lsdException w:unhideWhenUsed="0" w:uiPriority="0" w:semiHidden="0" w:name="List Continue 3"/>
+    <w:lsdException w:qFormat="1" w:unhideWhenUsed="0" w:uiPriority="0" w:semiHidden="0" w:name="List Continue 3"/>
     <w:lsdException w:qFormat="1" w:unhideWhenUsed="0" w:uiPriority="0" w:semiHidden="0" w:name="List Continue 4"/>
-    <w:lsdException w:unhideWhenUsed="0" w:uiPriority="0" w:semiHidden="0" w:name="List Continue 5"/>
+    <w:lsdException w:qFormat="1" w:unhideWhenUsed="0" w:uiPriority="0" w:semiHidden="0" w:name="List Continue 5"/>
     <w:lsdException w:unhideWhenUsed="0" w:uiPriority="0" w:semiHidden="0" w:name="Message Header"/>
     <w:lsdException w:qFormat="1" w:unhideWhenUsed="0" w:uiPriority="0" w:semiHidden="0" w:name="Subtitle"/>
     <w:lsdException w:qFormat="1" w:unhideWhenUsed="0" w:uiPriority="0" w:semiHidden="0" w:name="Salutation"/>
@@ -23149,7 +23120,7 @@
     <w:lsdException w:qFormat="1" w:unhideWhenUsed="0" w:uiPriority="0" w:semiHidden="0" w:name="Strong"/>
     <w:lsdException w:qFormat="1" w:unhideWhenUsed="0" w:uiPriority="0" w:semiHidden="0" w:name="Emphasis"/>
     <w:lsdException w:qFormat="1" w:unhideWhenUsed="0" w:uiPriority="0" w:semiHidden="0" w:name="Document Map"/>
-    <w:lsdException w:unhideWhenUsed="0" w:uiPriority="0" w:semiHidden="0" w:name="Plain Text"/>
+    <w:lsdException w:qFormat="1" w:unhideWhenUsed="0" w:uiPriority="0" w:semiHidden="0" w:name="Plain Text"/>
     <w:lsdException w:qFormat="1" w:unhideWhenUsed="0" w:uiPriority="0" w:semiHidden="0" w:name="E-mail Signature"/>
     <w:lsdException w:unhideWhenUsed="0" w:uiPriority="0" w:semiHidden="0" w:name="Normal (Web)"/>
     <w:lsdException w:qFormat="1" w:unhideWhenUsed="0" w:uiPriority="0" w:semiHidden="0" w:name="HTML Acronym"/>
@@ -23165,50 +23136,50 @@
     <w:lsdException w:qFormat="1" w:unhideWhenUsed="0" w:uiPriority="0" w:name="Normal Table"/>
     <w:lsdException w:qFormat="1" w:unhideWhenUsed="0" w:uiPriority="0" w:semiHidden="0" w:name="annotation subject"/>
     <w:lsdException w:qFormat="1" w:unhideWhenUsed="0" w:uiPriority="0" w:semiHidden="0" w:name="Table Simple 1"/>
-    <w:lsdException w:unhideWhenUsed="0" w:uiPriority="0" w:semiHidden="0" w:name="Table Simple 2"/>
-    <w:lsdException w:unhideWhenUsed="0" w:uiPriority="0" w:semiHidden="0" w:name="Table Simple 3"/>
-    <w:lsdException w:unhideWhenUsed="0" w:uiPriority="0" w:semiHidden="0" w:name="Table Classic 1"/>
-    <w:lsdException w:unhideWhenUsed="0" w:uiPriority="0" w:semiHidden="0" w:name="Table Classic 2"/>
-    <w:lsdException w:unhideWhenUsed="0" w:uiPriority="0" w:semiHidden="0" w:name="Table Classic 3"/>
-    <w:lsdException w:unhideWhenUsed="0" w:uiPriority="0" w:semiHidden="0" w:name="Table Classic 4"/>
-    <w:lsdException w:unhideWhenUsed="0" w:uiPriority="0" w:semiHidden="0" w:name="Table Colorful 1"/>
+    <w:lsdException w:qFormat="1" w:unhideWhenUsed="0" w:uiPriority="0" w:semiHidden="0" w:name="Table Simple 2"/>
+    <w:lsdException w:qFormat="1" w:unhideWhenUsed="0" w:uiPriority="0" w:semiHidden="0" w:name="Table Simple 3"/>
+    <w:lsdException w:qFormat="1" w:unhideWhenUsed="0" w:uiPriority="0" w:semiHidden="0" w:name="Table Classic 1"/>
+    <w:lsdException w:qFormat="1" w:unhideWhenUsed="0" w:uiPriority="0" w:semiHidden="0" w:name="Table Classic 2"/>
+    <w:lsdException w:qFormat="1" w:unhideWhenUsed="0" w:uiPriority="0" w:semiHidden="0" w:name="Table Classic 3"/>
+    <w:lsdException w:qFormat="1" w:unhideWhenUsed="0" w:uiPriority="0" w:semiHidden="0" w:name="Table Classic 4"/>
+    <w:lsdException w:qFormat="1" w:unhideWhenUsed="0" w:uiPriority="0" w:semiHidden="0" w:name="Table Colorful 1"/>
     <w:lsdException w:qFormat="1" w:unhideWhenUsed="0" w:uiPriority="0" w:semiHidden="0" w:name="Table Colorful 2"/>
     <w:lsdException w:qFormat="1" w:unhideWhenUsed="0" w:uiPriority="0" w:semiHidden="0" w:name="Table Colorful 3"/>
     <w:lsdException w:qFormat="1" w:unhideWhenUsed="0" w:uiPriority="0" w:semiHidden="0" w:name="Table Columns 1"/>
     <w:lsdException w:qFormat="1" w:unhideWhenUsed="0" w:uiPriority="0" w:semiHidden="0" w:name="Table Columns 2"/>
-    <w:lsdException w:unhideWhenUsed="0" w:uiPriority="0" w:semiHidden="0" w:name="Table Columns 3"/>
-    <w:lsdException w:unhideWhenUsed="0" w:uiPriority="0" w:semiHidden="0" w:name="Table Columns 4"/>
+    <w:lsdException w:qFormat="1" w:unhideWhenUsed="0" w:uiPriority="0" w:semiHidden="0" w:name="Table Columns 3"/>
+    <w:lsdException w:qFormat="1" w:unhideWhenUsed="0" w:uiPriority="0" w:semiHidden="0" w:name="Table Columns 4"/>
     <w:lsdException w:qFormat="1" w:unhideWhenUsed="0" w:uiPriority="0" w:semiHidden="0" w:name="Table Columns 5"/>
     <w:lsdException w:qFormat="1" w:unhideWhenUsed="0" w:uiPriority="0" w:semiHidden="0" w:name="Table Grid 1"/>
     <w:lsdException w:qFormat="1" w:unhideWhenUsed="0" w:uiPriority="0" w:semiHidden="0" w:name="Table Grid 2"/>
     <w:lsdException w:qFormat="1" w:unhideWhenUsed="0" w:uiPriority="0" w:semiHidden="0" w:name="Table Grid 3"/>
     <w:lsdException w:qFormat="1" w:unhideWhenUsed="0" w:uiPriority="0" w:semiHidden="0" w:name="Table Grid 4"/>
-    <w:lsdException w:unhideWhenUsed="0" w:uiPriority="0" w:semiHidden="0" w:name="Table Grid 5"/>
+    <w:lsdException w:qFormat="1" w:unhideWhenUsed="0" w:uiPriority="0" w:semiHidden="0" w:name="Table Grid 5"/>
     <w:lsdException w:qFormat="1" w:unhideWhenUsed="0" w:uiPriority="0" w:semiHidden="0" w:name="Table Grid 6"/>
     <w:lsdException w:qFormat="1" w:unhideWhenUsed="0" w:uiPriority="0" w:semiHidden="0" w:name="Table Grid 7"/>
-    <w:lsdException w:unhideWhenUsed="0" w:uiPriority="0" w:semiHidden="0" w:name="Table Grid 8"/>
-    <w:lsdException w:unhideWhenUsed="0" w:uiPriority="0" w:semiHidden="0" w:name="Table List 1"/>
-    <w:lsdException w:unhideWhenUsed="0" w:uiPriority="0" w:semiHidden="0" w:name="Table List 2"/>
+    <w:lsdException w:qFormat="1" w:unhideWhenUsed="0" w:uiPriority="0" w:semiHidden="0" w:name="Table Grid 8"/>
+    <w:lsdException w:qFormat="1" w:unhideWhenUsed="0" w:uiPriority="0" w:semiHidden="0" w:name="Table List 1"/>
+    <w:lsdException w:qFormat="1" w:unhideWhenUsed="0" w:uiPriority="0" w:semiHidden="0" w:name="Table List 2"/>
     <w:lsdException w:qFormat="1" w:unhideWhenUsed="0" w:uiPriority="0" w:semiHidden="0" w:name="Table List 3"/>
     <w:lsdException w:qFormat="1" w:unhideWhenUsed="0" w:uiPriority="0" w:semiHidden="0" w:name="Table List 4"/>
     <w:lsdException w:qFormat="1" w:unhideWhenUsed="0" w:uiPriority="0" w:semiHidden="0" w:name="Table List 5"/>
     <w:lsdException w:qFormat="1" w:unhideWhenUsed="0" w:uiPriority="0" w:semiHidden="0" w:name="Table List 6"/>
-    <w:lsdException w:unhideWhenUsed="0" w:uiPriority="0" w:semiHidden="0" w:name="Table List 7"/>
+    <w:lsdException w:qFormat="1" w:unhideWhenUsed="0" w:uiPriority="0" w:semiHidden="0" w:name="Table List 7"/>
     <w:lsdException w:qFormat="1" w:unhideWhenUsed="0" w:uiPriority="0" w:semiHidden="0" w:name="Table List 8"/>
-    <w:lsdException w:unhideWhenUsed="0" w:uiPriority="0" w:semiHidden="0" w:name="Table 3D effects 1"/>
-    <w:lsdException w:unhideWhenUsed="0" w:uiPriority="0" w:semiHidden="0" w:name="Table 3D effects 2"/>
-    <w:lsdException w:unhideWhenUsed="0" w:uiPriority="0" w:semiHidden="0" w:name="Table 3D effects 3"/>
+    <w:lsdException w:qFormat="1" w:unhideWhenUsed="0" w:uiPriority="0" w:semiHidden="0" w:name="Table 3D effects 1"/>
+    <w:lsdException w:qFormat="1" w:unhideWhenUsed="0" w:uiPriority="0" w:semiHidden="0" w:name="Table 3D effects 2"/>
+    <w:lsdException w:qFormat="1" w:unhideWhenUsed="0" w:uiPriority="0" w:semiHidden="0" w:name="Table 3D effects 3"/>
     <w:lsdException w:qFormat="1" w:unhideWhenUsed="0" w:uiPriority="0" w:semiHidden="0" w:name="Table Contemporary"/>
-    <w:lsdException w:unhideWhenUsed="0" w:uiPriority="0" w:semiHidden="0" w:name="Table Elegant"/>
-    <w:lsdException w:unhideWhenUsed="0" w:uiPriority="0" w:semiHidden="0" w:name="Table Professional"/>
-    <w:lsdException w:unhideWhenUsed="0" w:uiPriority="0" w:semiHidden="0" w:name="Table Subtle 1"/>
-    <w:lsdException w:unhideWhenUsed="0" w:uiPriority="0" w:semiHidden="0" w:name="Table Subtle 2"/>
-    <w:lsdException w:unhideWhenUsed="0" w:uiPriority="0" w:semiHidden="0" w:name="Table Web 1"/>
-    <w:lsdException w:unhideWhenUsed="0" w:uiPriority="0" w:semiHidden="0" w:name="Table Web 2"/>
+    <w:lsdException w:qFormat="1" w:unhideWhenUsed="0" w:uiPriority="0" w:semiHidden="0" w:name="Table Elegant"/>
+    <w:lsdException w:qFormat="1" w:unhideWhenUsed="0" w:uiPriority="0" w:semiHidden="0" w:name="Table Professional"/>
+    <w:lsdException w:qFormat="1" w:unhideWhenUsed="0" w:uiPriority="0" w:semiHidden="0" w:name="Table Subtle 1"/>
+    <w:lsdException w:qFormat="1" w:unhideWhenUsed="0" w:uiPriority="0" w:semiHidden="0" w:name="Table Subtle 2"/>
+    <w:lsdException w:qFormat="1" w:unhideWhenUsed="0" w:uiPriority="0" w:semiHidden="0" w:name="Table Web 1"/>
+    <w:lsdException w:qFormat="1" w:unhideWhenUsed="0" w:uiPriority="0" w:semiHidden="0" w:name="Table Web 2"/>
     <w:lsdException w:qFormat="1" w:unhideWhenUsed="0" w:uiPriority="0" w:semiHidden="0" w:name="Table Web 3"/>
     <w:lsdException w:qFormat="1" w:unhideWhenUsed="0" w:uiPriority="0" w:semiHidden="0" w:name="Balloon Text"/>
-    <w:lsdException w:unhideWhenUsed="0" w:uiPriority="0" w:semiHidden="0" w:name="Table Grid"/>
-    <w:lsdException w:unhideWhenUsed="0" w:uiPriority="0" w:semiHidden="0" w:name="Table Theme"/>
+    <w:lsdException w:qFormat="1" w:unhideWhenUsed="0" w:uiPriority="0" w:semiHidden="0" w:name="Table Grid"/>
+    <w:lsdException w:qFormat="1" w:unhideWhenUsed="0" w:uiPriority="0" w:semiHidden="0" w:name="Table Theme"/>
     <w:lsdException w:unhideWhenUsed="0" w:uiPriority="60" w:semiHidden="0" w:name="Light Shading"/>
     <w:lsdException w:qFormat="1" w:unhideWhenUsed="0" w:uiPriority="61" w:semiHidden="0" w:name="Light List"/>
     <w:lsdException w:qFormat="1" w:unhideWhenUsed="0" w:uiPriority="62" w:semiHidden="0" w:name="Light Grid"/>
@@ -23987,6 +23958,7 @@
     <w:name w:val="index 6"/>
     <w:basedOn w:val="1"/>
     <w:next w:val="1"/>
+    <w:qFormat/>
     <w:uiPriority w:val="0"/>
     <w:pPr>
       <w:ind w:left="1000" w:leftChars="1000"/>
@@ -24006,6 +23978,7 @@
     <w:name w:val="index 8"/>
     <w:basedOn w:val="1"/>
     <w:next w:val="1"/>
+    <w:qFormat/>
     <w:uiPriority w:val="0"/>
     <w:pPr>
       <w:ind w:left="1400" w:leftChars="1400"/>
@@ -24047,6 +24020,7 @@
   <w:style w:type="paragraph" w:styleId="64">
     <w:name w:val="List 2"/>
     <w:basedOn w:val="1"/>
+    <w:qFormat/>
     <w:uiPriority w:val="0"/>
     <w:pPr>
       <w:ind w:left="100" w:leftChars="200" w:hanging="200" w:hangingChars="200"/>
@@ -24063,6 +24037,7 @@
   <w:style w:type="paragraph" w:styleId="66">
     <w:name w:val="List 4"/>
     <w:basedOn w:val="1"/>
+    <w:qFormat/>
     <w:uiPriority w:val="0"/>
     <w:pPr>
       <w:ind w:left="100" w:leftChars="600" w:hanging="200" w:hangingChars="200"/>
@@ -24080,6 +24055,7 @@
   <w:style w:type="paragraph" w:styleId="68">
     <w:name w:val="List Bullet"/>
     <w:basedOn w:val="1"/>
+    <w:qFormat/>
     <w:uiPriority w:val="0"/>
     <w:pPr>
       <w:numPr>
@@ -24138,6 +24114,7 @@
   <w:style w:type="paragraph" w:styleId="73">
     <w:name w:val="List Continue"/>
     <w:basedOn w:val="1"/>
+    <w:qFormat/>
     <w:uiPriority w:val="0"/>
     <w:pPr>
       <w:spacing w:after="120"/>
@@ -24157,6 +24134,7 @@
   <w:style w:type="paragraph" w:styleId="75">
     <w:name w:val="List Continue 3"/>
     <w:basedOn w:val="1"/>
+    <w:qFormat/>
     <w:uiPriority w:val="0"/>
     <w:pPr>
       <w:spacing w:after="120"/>
@@ -24176,6 +24154,7 @@
   <w:style w:type="paragraph" w:styleId="77">
     <w:name w:val="List Continue 5"/>
     <w:basedOn w:val="1"/>
+    <w:qFormat/>
     <w:uiPriority w:val="0"/>
     <w:pPr>
       <w:spacing w:after="120"/>
@@ -24185,6 +24164,7 @@
   <w:style w:type="paragraph" w:styleId="78">
     <w:name w:val="List Number"/>
     <w:basedOn w:val="1"/>
+    <w:qFormat/>
     <w:uiPriority w:val="0"/>
     <w:pPr>
       <w:numPr>
@@ -24196,6 +24176,7 @@
   <w:style w:type="paragraph" w:styleId="79">
     <w:name w:val="List Number 2"/>
     <w:basedOn w:val="1"/>
+    <w:qFormat/>
     <w:uiPriority w:val="0"/>
     <w:pPr>
       <w:numPr>
@@ -24231,6 +24212,7 @@
   <w:style w:type="paragraph" w:styleId="82">
     <w:name w:val="List Number 5"/>
     <w:basedOn w:val="1"/>
+    <w:qFormat/>
     <w:uiPriority w:val="0"/>
     <w:pPr>
       <w:numPr>
@@ -24325,6 +24307,7 @@
   <w:style w:type="paragraph" w:styleId="89">
     <w:name w:val="Plain Text"/>
     <w:basedOn w:val="1"/>
+    <w:qFormat/>
     <w:uiPriority w:val="0"/>
     <w:rPr>
       <w:rFonts w:ascii="SimSun" w:hAnsi="Courier New" w:cs="Courier New"/>
@@ -24341,6 +24324,7 @@
   <w:style w:type="paragraph" w:styleId="91">
     <w:name w:val="Signature"/>
     <w:basedOn w:val="1"/>
+    <w:qFormat/>
     <w:uiPriority w:val="0"/>
     <w:pPr>
       <w:ind w:left="100" w:leftChars="2100"/>
@@ -24378,6 +24362,7 @@
   <w:style w:type="table" w:styleId="94">
     <w:name w:val="Table 3D effects 1"/>
     <w:basedOn w:val="12"/>
+    <w:qFormat/>
     <w:uiPriority w:val="0"/>
     <w:pPr>
       <w:widowControl w:val="0"/>
@@ -24487,6 +24472,7 @@
   <w:style w:type="table" w:styleId="95">
     <w:name w:val="Table 3D effects 2"/>
     <w:basedOn w:val="12"/>
+    <w:qFormat/>
     <w:uiPriority w:val="0"/>
     <w:pPr>
       <w:widowControl w:val="0"/>
@@ -24561,6 +24547,7 @@
   <w:style w:type="table" w:styleId="96">
     <w:name w:val="Table 3D effects 3"/>
     <w:basedOn w:val="12"/>
+    <w:qFormat/>
     <w:uiPriority w:val="0"/>
     <w:pPr>
       <w:widowControl w:val="0"/>
@@ -24651,6 +24638,7 @@
   <w:style w:type="table" w:styleId="97">
     <w:name w:val="Table Classic 1"/>
     <w:basedOn w:val="12"/>
+    <w:qFormat/>
     <w:uiPriority w:val="0"/>
     <w:pPr>
       <w:widowControl w:val="0"/>
@@ -24734,6 +24722,7 @@
   <w:style w:type="table" w:styleId="98">
     <w:name w:val="Table Classic 2"/>
     <w:basedOn w:val="12"/>
+    <w:qFormat/>
     <w:uiPriority w:val="0"/>
     <w:pPr>
       <w:widowControl w:val="0"/>
@@ -24825,6 +24814,7 @@
   <w:style w:type="table" w:styleId="99">
     <w:name w:val="Table Classic 3"/>
     <w:basedOn w:val="12"/>
+    <w:qFormat/>
     <w:uiPriority w:val="0"/>
     <w:pPr>
       <w:widowControl w:val="0"/>
@@ -24894,6 +24884,7 @@
   <w:style w:type="table" w:styleId="100">
     <w:name w:val="Table Classic 4"/>
     <w:basedOn w:val="12"/>
+    <w:qFormat/>
     <w:uiPriority w:val="0"/>
     <w:pPr>
       <w:widowControl w:val="0"/>
@@ -24984,6 +24975,7 @@
   <w:style w:type="table" w:styleId="101">
     <w:name w:val="Table Colorful 1"/>
     <w:basedOn w:val="12"/>
+    <w:qFormat/>
     <w:uiPriority w:val="0"/>
     <w:pPr>
       <w:widowControl w:val="0"/>
@@ -25434,6 +25426,7 @@
   <w:style w:type="table" w:styleId="106">
     <w:name w:val="Table Columns 3"/>
     <w:basedOn w:val="12"/>
+    <w:qFormat/>
     <w:uiPriority w:val="0"/>
     <w:pPr>
       <w:widowControl w:val="0"/>
@@ -25540,6 +25533,7 @@
   <w:style w:type="table" w:styleId="107">
     <w:name w:val="Table Columns 4"/>
     <w:basedOn w:val="12"/>
+    <w:qFormat/>
     <w:uiPriority w:val="0"/>
     <w:pPr>
       <w:widowControl w:val="0"/>
@@ -25755,6 +25749,7 @@
   <w:style w:type="table" w:styleId="110">
     <w:name w:val="Table Elegant"/>
     <w:basedOn w:val="12"/>
+    <w:qFormat/>
     <w:uiPriority w:val="0"/>
     <w:pPr>
       <w:widowControl w:val="0"/>
@@ -25790,6 +25785,7 @@
   <w:style w:type="table" w:styleId="111">
     <w:name w:val="Table Grid"/>
     <w:basedOn w:val="12"/>
+    <w:qFormat/>
     <w:uiPriority w:val="0"/>
     <w:pPr>
       <w:widowControl w:val="0"/>
@@ -26072,6 +26068,7 @@
   <w:style w:type="table" w:styleId="116">
     <w:name w:val="Table Grid 5"/>
     <w:basedOn w:val="12"/>
+    <w:qFormat/>
     <w:uiPriority w:val="0"/>
     <w:pPr>
       <w:widowControl w:val="0"/>
@@ -26300,6 +26297,7 @@
   <w:style w:type="table" w:styleId="119">
     <w:name w:val="Table Grid 8"/>
     <w:basedOn w:val="12"/>
+    <w:qFormat/>
     <w:uiPriority w:val="0"/>
     <w:pPr>
       <w:widowControl w:val="0"/>
@@ -26365,6 +26363,7 @@
   <w:style w:type="table" w:styleId="120">
     <w:name w:val="Table List 1"/>
     <w:basedOn w:val="12"/>
+    <w:qFormat/>
     <w:uiPriority w:val="0"/>
     <w:pPr>
       <w:widowControl w:val="0"/>
@@ -26448,6 +26447,7 @@
   <w:style w:type="table" w:styleId="121">
     <w:name w:val="Table List 2"/>
     <w:basedOn w:val="12"/>
+    <w:qFormat/>
     <w:uiPriority w:val="0"/>
     <w:pPr>
       <w:widowControl w:val="0"/>
@@ -26740,6 +26740,7 @@
   <w:style w:type="table" w:styleId="126">
     <w:name w:val="Table List 7"/>
     <w:basedOn w:val="12"/>
+    <w:qFormat/>
     <w:uiPriority w:val="0"/>
     <w:pPr>
       <w:widowControl w:val="0"/>
@@ -26945,6 +26946,7 @@
     <w:name w:val="table of authorities"/>
     <w:basedOn w:val="1"/>
     <w:next w:val="1"/>
+    <w:qFormat/>
     <w:uiPriority w:val="0"/>
     <w:pPr>
       <w:ind w:left="420" w:leftChars="200"/>
@@ -26954,6 +26956,7 @@
     <w:name w:val="table of figures"/>
     <w:basedOn w:val="1"/>
     <w:next w:val="1"/>
+    <w:qFormat/>
     <w:uiPriority w:val="0"/>
     <w:pPr>
       <w:ind w:leftChars="200" w:hanging="200" w:hangingChars="200"/>
@@ -26962,6 +26965,7 @@
   <w:style w:type="table" w:styleId="130">
     <w:name w:val="Table Professional"/>
     <w:basedOn w:val="12"/>
+    <w:qFormat/>
     <w:uiPriority w:val="0"/>
     <w:pPr>
       <w:widowControl w:val="0"/>
@@ -27038,6 +27042,7 @@
   <w:style w:type="table" w:styleId="132">
     <w:name w:val="Table Simple 2"/>
     <w:basedOn w:val="12"/>
+    <w:qFormat/>
     <w:uiPriority w:val="0"/>
     <w:pPr>
       <w:widowControl w:val="0"/>
@@ -27133,6 +27138,7 @@
   <w:style w:type="table" w:styleId="133">
     <w:name w:val="Table Simple 3"/>
     <w:basedOn w:val="12"/>
+    <w:qFormat/>
     <w:uiPriority w:val="0"/>
     <w:pPr>
       <w:widowControl w:val="0"/>
@@ -27168,6 +27174,7 @@
   <w:style w:type="table" w:styleId="134">
     <w:name w:val="Table Subtle 1"/>
     <w:basedOn w:val="12"/>
+    <w:qFormat/>
     <w:uiPriority w:val="0"/>
     <w:pPr>
       <w:widowControl w:val="0"/>
@@ -27259,6 +27266,7 @@
   <w:style w:type="table" w:styleId="135">
     <w:name w:val="Table Subtle 2"/>
     <w:basedOn w:val="12"/>
+    <w:qFormat/>
     <w:uiPriority w:val="0"/>
     <w:pPr>
       <w:widowControl w:val="0"/>
@@ -27342,6 +27350,7 @@
   <w:style w:type="table" w:styleId="136">
     <w:name w:val="Table Theme"/>
     <w:basedOn w:val="12"/>
+    <w:qFormat/>
     <w:uiPriority w:val="0"/>
     <w:pPr>
       <w:widowControl w:val="0"/>
@@ -27361,6 +27370,7 @@
   <w:style w:type="table" w:styleId="137">
     <w:name w:val="Table Web 1"/>
     <w:basedOn w:val="12"/>
+    <w:qFormat/>
     <w:uiPriority w:val="0"/>
     <w:pPr>
       <w:widowControl w:val="0"/>
@@ -27399,6 +27409,7 @@
   <w:style w:type="table" w:styleId="138">
     <w:name w:val="Table Web 2"/>
     <w:basedOn w:val="12"/>
+    <w:qFormat/>
     <w:uiPriority w:val="0"/>
     <w:pPr>
       <w:widowControl w:val="0"/>

</xml_diff>